<commit_message>
Modul Word Getaran Mekanik: checkpoint Modul 8-10 + update Modul 7
Lanjutan checkpoint batch 28-modul. Modul 7 ter-update sedikit dari
commit checkpoint sebelumnya (agent tampaknya melakukan penyesuaian
akhir setelah pelaporan awal) -- diverifikasi ulang (23 halaman, 3
tabel, 8 gambar, struktur OOXML valid) sebelum di-commit ulang.

Co-Authored-By: Claude Sonnet 5 <noreply@anthropic.com>
Claude-Session: https://claude.ai/code/session_01MRPE2Wfn5ruEpMsNER92uG
</commit_message>
<xml_diff>
--- a/Getaran-Mekanik/Modul-Word/Modul-7-Frekuensi-Pribadi-Sistem-2-DoF.docx
+++ b/Getaran-Mekanik/Modul-Word/Modul-7-Frekuensi-Pribadi-Sistem-2-DoF.docx
@@ -3520,6 +3520,30 @@
           <w:i w:val="0"/>
           <w:sz w:val="22"/>
         </w:rPr>
+        <w:t xml:space="preserve">Konvensi Koordinat dan Posisi Setimbang. </w:t>
+      </w:r>
+      <w:r>
+        <w:rPr>
+          <w:rFonts w:ascii="Arial" w:hAnsi="Arial" w:cs="Arial"/>
+          <w:b w:val="0"/>
+          <w:i w:val="0"/>
+          <w:sz w:val="22"/>
+        </w:rPr>
+        <w:t>Sebelum menurunkan persamaan gerak, penting menegaskan konvensi koordinat yang dipakai: x1 dan x2 selalu diukur dari posisi setimbang statis (static equilibrium) masing-masing massa, bukan dari posisi pegas dalam keadaan bebas-tegangan. Sistem referensi modul ini berorientasi horizontal (pegas dan massa terletak pada bidang datar), sehingga gaya gravitasi bekerja tegak lurus terhadap arah gerak dan tidak muncul sama sekali dalam persamaan gerak maupun dalam matriks kekakuan K. Kondisi ini berbeda dengan sistem massa-pegas vertikal yang dibahas pada Pertemuan 1-3 untuk kasus 1 DoF, di mana defleksi statis akibat berat massa harus terlebih dahulu dipisahkan dari simpangan dinamis sebelum persamaan gerak disederhanakan menjadi bentuk tanpa suku gravitasi. Prinsip pemisahan defleksi statis ini tetap berlaku untuk sistem 2 DoF vertikal atau miring; hasil akhirnya identik dengan formulasi horizontal modul ini selama x1 dan x2 diukur konsisten dari posisi setimbang statis masing-masing massa.</w:t>
+      </w:r>
+    </w:p>
+    <w:p>
+      <w:pPr>
+        <w:spacing w:line="360" w:lineRule="auto" w:after="120"/>
+        <w:jc w:val="both"/>
+      </w:pPr>
+      <w:r>
+        <w:rPr>
+          <w:rFonts w:ascii="Arial" w:hAnsi="Arial" w:cs="Arial"/>
+          <w:b/>
+          <w:i w:val="0"/>
+          <w:sz w:val="22"/>
+        </w:rPr>
         <w:t xml:space="preserve">Free-Body Diagram dan Hukum Newton. </w:t>
       </w:r>
       <w:r>
@@ -4158,6 +4182,30 @@
     </w:p>
     <w:p>
       <w:pPr>
+        <w:spacing w:line="360" w:lineRule="auto" w:after="120"/>
+        <w:jc w:val="both"/>
+      </w:pPr>
+      <w:r>
+        <w:rPr>
+          <w:rFonts w:ascii="Arial" w:hAnsi="Arial" w:cs="Arial"/>
+          <w:b/>
+          <w:i w:val="0"/>
+          <w:sz w:val="22"/>
+        </w:rPr>
+        <w:t xml:space="preserve">Visualisasi Skematik Kedua Mode. </w:t>
+      </w:r>
+      <w:r>
+        <w:rPr>
+          <w:rFonts w:ascii="Arial" w:hAnsi="Arial" w:cs="Arial"/>
+          <w:b w:val="0"/>
+          <w:i w:val="0"/>
+          <w:sz w:val="22"/>
+        </w:rPr>
+        <w:t>Kedua hasil aljabar di atas jauh lebih mudah dipahami secara visual daripada hanya lewat notasi vektor. Gambar 4 menerjemahkan derivasi Mode 1 dan Mode 2 menjadi skematik: panah hijau pada Mode 1 menunjukkan kedua massa bergerak ke arah yang sama persis (konsisten dengan X1=X2), dengan pegas tengah digambar putus-putus abu-abu untuk menandakan bahwa pegas tersebut tidak meregang maupun menekan pada mode ini. Sebaliknya, panah merah pada Mode 2 menunjukkan kedua massa bergerak berlawanan arah (konsisten dengan X1=-X2), dengan pegas tengah digambar solid berwarna merah untuk menandakan bahwa pegas tersebut aktif meregang dan menekan secara bergantian sepanjang siklus getaran.</w:t>
+      </w:r>
+    </w:p>
+    <w:p>
+      <w:pPr>
         <w:keepNext/>
         <w:spacing w:before="120" w:after="40"/>
         <w:jc w:val="center"/>
@@ -4234,7 +4282,7 @@
           <w:i w:val="0"/>
           <w:sz w:val="22"/>
         </w:rPr>
-        <w:t>Kedua mode shape memiliki penjelasan fisis yang intuitif dan langsung menjelaskan mengapa ω1 lebih kecil dari ω2. Pada Mode 1, karena kedua massa bergerak searah dan sama besar, jarak antar-keduanya tidak pernah berubah, sehingga pegas tengah k2 sama sekali tidak meregang atau menekan (tidak ikut bekerja). Sistem efektif hanya "merasakan" kekakuan k1 dan k3 yang bekerja secara terpisah pada tiap massa, sehingga ω1_efektif=√((k1+k3)/m)=√(200/1)=... namun karena tiap massa hanya merasakan satu pegas dinding pada Mode 1 in-phase penuh, hasil analitik ω1=10 tepat konsisten dengan penjabaran ini.</w:t>
+        <w:t>Kedua mode shape memiliki penjelasan fisis yang intuitif dan langsung menjelaskan mengapa ω1 lebih kecil dari ω2. Pada Mode 1, karena kedua massa bergerak searah dan sama besar, jarak antar-keduanya tidak pernah berubah, sehingga pegas tengah k2 sama sekali tidak meregang atau menekan (tidak ikut bekerja). Tiap massa efektif hanya "merasakan" kekakuan pegas dindingnya sendiri: persamaan gerak massa 1 tereduksi menjadi m·ẍ1=-k1x1, sehingga ω1_efektif=√(k1/m)=√(100/1)=10 rad/s, tepat cocok dengan hasil eigenvalue problem pada Bagian sebelumnya.</w:t>
       </w:r>
     </w:p>
     <w:p>
@@ -4259,6 +4307,30 @@
           <w:sz w:val="22"/>
         </w:rPr>
         <w:t>Sebaliknya pada Mode 2, karena kedua massa bergerak berlawanan arah, jarak antar-keduanya berubah dua kali lebih besar dibandingkan jika hanya satu massa yang bergerak, sehingga pegas tengah k2 meregang dan menekan secara maksimal pada setiap siklus. Kekakuan efektif yang dirasakan sistem menjadi jauh lebih besar (melibatkan k1 ditambah dua kali k2), sehingga frekuensi pribadinya juga lebih tinggi: ω2_efektif=√((k1+2k2)/m)=√(300/1)=17,32 rad/s, tepat cocok dengan hasil eigenvalue problem pada Bagian sebelumnya.</w:t>
+      </w:r>
+    </w:p>
+    <w:p>
+      <w:pPr>
+        <w:spacing w:line="360" w:lineRule="auto" w:after="120"/>
+        <w:jc w:val="both"/>
+      </w:pPr>
+      <w:r>
+        <w:rPr>
+          <w:rFonts w:ascii="Arial" w:hAnsi="Arial" w:cs="Arial"/>
+          <w:b/>
+          <w:i w:val="0"/>
+          <w:sz w:val="22"/>
+        </w:rPr>
+        <w:t xml:space="preserve">Generalisasi Pola untuk Sistem Simetris Apa Pun. </w:t>
+      </w:r>
+      <w:r>
+        <w:rPr>
+          <w:rFonts w:ascii="Arial" w:hAnsi="Arial" w:cs="Arial"/>
+          <w:b w:val="0"/>
+          <w:i w:val="0"/>
+          <w:sz w:val="22"/>
+        </w:rPr>
+        <w:t>Pola ω1_efektif=√(k1/m) dan ω2_efektif=√((k1+2k2)/m) yang diturunkan di atas sebenarnya berlaku umum untuk sistem dua-massa-tiga-pegas simetris apa pun (m1=m2=m dan k1=k3), bukan hanya untuk nilai numerik referensi modul ini. Rasio kedua frekuensi pribadi selalu memenuhi (ω2/ω1)²=(k1+2k2)/k1, yang berarti semakin lemah pegas tengah k2 relatif terhadap pegas dinding k1, semakin dekat ω2 terhadap ω1 (kedua mode "berhimpitan"); sebaliknya semakin kuat k2, semakin jauh kedua frekuensi terpisah. Insinyur perancang sistem 2 DoF dapat memanfaatkan hubungan ini untuk sengaja mengatur seberapa jauh kedua frekuensi pribadi terpisah, sebuah pertimbangan penting yang akan muncul kembali pada perancangan vibration absorber di Bagian Aplikasi Industri.</w:t>
       </w:r>
     </w:p>
     <w:p>
@@ -6288,6 +6360,30 @@
           <w:sz w:val="22"/>
         </w:rPr>
         <w:t>Cell 2 adalah inti komputasi Pertemuan 7: memanggil numpy.linalg.eig pada matriks dinamis A=M⁻¹K untuk memperoleh eigenvalue (ω²) dan eigenvector (mode shape) sekaligus, lalu mengurutkan hasil dari kecil ke besar memakai np.argsort agar konsisten dengan konvensi ω1 kurang dari ω2 yang dipakai di seluruh modul. Gambar 7 menunjukkan cuplikan kode lengkap Cell 2.</w:t>
+      </w:r>
+    </w:p>
+    <w:p>
+      <w:pPr>
+        <w:spacing w:line="360" w:lineRule="auto" w:after="120"/>
+        <w:jc w:val="both"/>
+      </w:pPr>
+      <w:r>
+        <w:rPr>
+          <w:rFonts w:ascii="Arial" w:hAnsi="Arial" w:cs="Arial"/>
+          <w:b/>
+          <w:i w:val="0"/>
+          <w:sz w:val="22"/>
+        </w:rPr>
+        <w:t xml:space="preserve">Catatan Teknis: Orientasi Kolom Eigenvector dan Urutan Hasil. </w:t>
+      </w:r>
+      <w:r>
+        <w:rPr>
+          <w:rFonts w:ascii="Arial" w:hAnsi="Arial" w:cs="Arial"/>
+          <w:b w:val="0"/>
+          <w:i w:val="0"/>
+          <w:sz w:val="22"/>
+        </w:rPr>
+        <w:t>Dua catatan teknis penting perlu diperhatikan mahasiswa saat memakai numpy.linalg.eig untuk sistem 2 DoF maupun sistem berorde lebih tinggi pada tugas-tugas berikutnya. Pertama, fungsi ini mengembalikan eigvecs sebagai matriks 2 kolom, dengan tiap kolom (bukan baris) mewakili satu eigenvector; mengambil eigvecs[:,0] memberi mode shape pertama secara utuh, sementara eigvecs[0,:] justru keliru karena hanya mengambil elemen pertama dari kedua mode. Kesalahan pengindeksan baris-versus-kolom ini adalah kesalahan pemula paling umum saat pertama kali memakai fungsi eigenvalue numerik. Kedua, numpy.linalg.eig tidak menjamin urutan eigenvalue dari kecil ke besar maupun tanda (sign) eigenvector yang konsisten; itulah sebabnya langkah np.argsort untuk mengurutkan omega dan langkah normalisasi elemen pertama menjadi 1 (dibahas pada Cell 3 berikutnya) selalu wajib dilakukan setelah pemanggilan eig, bukan opsional, agar hasil dapat dibandingkan secara konsisten dengan hasil analitik maupun dengan hasil run yang berbeda.</w:t>
       </w:r>
     </w:p>
     <w:p>

</xml_diff>